<commit_message>
Add TASM English version (v9) and rebuild all v9 DOCX with fixed table widths
- manuscript_v9_en_TASM.md/.docx + supplement_v9_en.md/.docx (Chicago author-date,
  Tables 1-8, Figures 1-5, Tables S1-S28, Figures S1-S2)
- tools/make_en_journal_v9.py (assembly + audits: Korean leftovers, numbering,
  citation <-> reference list), tools/make_supplement_v9_en.py, sources/en_v9/
- docx_polish.py: hyphen break opportunities; never shrink below no-wrap minimums
- refs: Yole Group key aligned with in-text citation (KnowMade, Sophia Antipolis)
- tools/build_v9_docx.sh rebuilds all six v9 DOCX; README/INDEX/handoff updated

Co-Authored-By: Claude Fable 5.1 <noreply@anthropic.com>
Claude-Session: https://claude.ai/code/session_01SvckvZxt3hAXTDPnm8YPEC
</commit_message>
<xml_diff>
--- a/journal/manuscript_v9_ko_JTI.docx
+++ b/journal/manuscript_v9_ko_JTI.docx
@@ -12389,7 +12389,7 @@
         <w:pStyle w:val="BodyText"/>
       </w:pPr>
       <w:r>
-        <w:t xml:space="preserve">Yole Group (KnowMade). (2024).</w:t>
+        <w:t xml:space="preserve">Yole Group. (2024).</w:t>
       </w:r>
       <w:r>
         <w:t xml:space="preserve"> </w:t>
@@ -12405,7 +12405,7 @@
         <w:t xml:space="preserve"> </w:t>
       </w:r>
       <w:r>
-        <w:t xml:space="preserve">[Industry report]. KnowMade.</w:t>
+        <w:t xml:space="preserve">[Industry report]. KnowMade (Yole Group).</w:t>
       </w:r>
     </w:p>
     <w:p>

</xml_diff>